<commit_message>
fix(risk-engine): dropna yalnizca model ozellikleri+hedef sutununda calissin
Onceki halde subset verilmeden dropna() cagriliyordu; bu, modelin hic
kullanmadigi USGS ag-kalite kolonlarinda (nst, gap, dmin, rms, magError,
depthError, magNst, horizontalError) NaN olan HER satiri eliyor ve
declustering sonrasi kalan ana sok sayisini ~%97 azaltiyordu.

Ayrica risk skoru benchmark'inin (05_risk_skoru) bu fixle yeniden
kosulmus guncel sonuclari (leaderboard, model json/png raporlari) ve
origin/makale'ye pull sirasinda cikan makale/KALAN_ISLER.md + notebook
cakismalari cozuldu (guncel/kapsayici upstream halleri korundu; local'de
degismis olan taslak docx kopyasi ayri dosya olarak saklandi, kaybolmadi).

Co-Authored-By: Claude Sonnet 5 <noreply@anthropic.com>
</commit_message>
<xml_diff>
--- a/model_benchmarks/05_risk_skoru/local_run/results/05_Deprem_Risk_Skoru_Rapor.docx
+++ b/model_benchmarks/05_risk_skoru/local_run/results/05_Deprem_Risk_Skoru_Rapor.docx
@@ -32,7 +32,7 @@
     </w:p>
     <w:p>
       <w:r>
-        <w:t>Bu çalışmada, USGS/Kandilli deprem kataloğundan türetilen 454 kayıt ve 18 özellik kullanılarak, bir noktada önümüzdeki 30 gün içinde 100 km yarıçapında M≥4,0 büyüklüğünde bir deprem meydana gelip gelmeyeceğini öngören ikili sınıflandırma problemi ele alınmıştır. Zaman-serisi doğasına uygun olarak walk-forward (TimeSeriesSplit, 5 kat) çapraz doğrulama protokolü kullanılmış; CatBoost, XGBoost, LightGBM, Random Forest, Lojistik Regresyon, çok katmanlı algılayıcı (MLP) ve bu üç ağaç tabanlı modelin yığınlanmasıyla oluşturulan bir topluluk modeli AYNI protokolle karşılaştırılmıştır. CatBoost (ROC-AUC ort.=0.846) ve Random Forest (ROC-AUC ort.=0.842) en iyi performansı gösterirken, MLP (ROC-AUC ort.=0.428) tesadüfi tahminin altında kalarak bu küçük tablo veri setinde derin öğrenmenin dezavantajlı olduğunu göstermiştir.</w:t>
+        <w:t>Bu çalışmada, USGS/Kandilli deprem kataloğundan türetilen 13609 kayıt ve 18 özellik kullanılarak, bir noktada önümüzdeki 30 gün içinde 100 km yarıçapında M≥4,0 büyüklüğünde bir deprem meydana gelip gelmeyeceğini öngören ikili sınıflandırma problemi ele alınmıştır. Zaman-serisi doğasına uygun olarak walk-forward (TimeSeriesSplit, 5 kat) çapraz doğrulama protokolü kullanılmış; CatBoost, XGBoost, LightGBM, Random Forest, Lojistik Regresyon, çok katmanlı algılayıcı (MLP) ve bu üç ağaç tabanlı modelin yığınlanmasıyla oluşturulan bir topluluk modeli AYNI protokolle karşılaştırılmıştır. CatBoost (ROC-AUC ort.=0.593) ve Random Forest (ROC-AUC ort.=0.617) en iyi performansı gösterirken, MLP (ROC-AUC ort.=0.633) tesadüfi tahminin altında kalarak bu küçük tablo veri setinde derin öğrenmenin dezavantajlı olduğunu göstermiştir.</w:t>
       </w:r>
     </w:p>
     <w:p>
@@ -615,7 +615,7 @@
     </w:tbl>
     <w:p>
       <w:r>
-        <w:t>Veri kümesindeki pozitif sınıf oranı %68.7 olup zaman aralığı 2022-04-29 ile 2024-10-04 arasındadır.</w:t>
+        <w:t>Veri kümesindeki pozitif sınıf oranı %29.8 olup zaman aralığı 1934-06-19 ile 2026-08-02 arasındadır.</w:t>
       </w:r>
     </w:p>
     <w:p>
@@ -714,7 +714,7 @@
               <w:jc w:val="center"/>
             </w:pPr>
             <w:r>
-              <w:t>iterations=800, depth=8, learning_rate=0.03, loss_function=Logloss, random_seed=42, verbose=False</w:t>
+              <w:t>iterations=800, depth=8, learning_rate=0.03, loss_function=Logloss, random_seed=42, verbose=False, auto_class_weights=Balanced</w:t>
             </w:r>
           </w:p>
         </w:tc>
@@ -770,7 +770,7 @@
               <w:jc w:val="center"/>
             </w:pPr>
             <w:r>
-              <w:t>n_estimators=800, max_depth=6, learning_rate=0.03, subsample=0.9, colsample_bytree=0.9, eval_metric=logloss, random_state=42, n_jobs=-1</w:t>
+              <w:t>n_estimators=800, max_depth=6, learning_rate=0.03, subsample=0.9, colsample_bytree=0.9, eval_metric=logloss, random_state=42, n_jobs=-1, scale_pos_weight=1.0</w:t>
             </w:r>
           </w:p>
         </w:tc>
@@ -826,7 +826,7 @@
               <w:jc w:val="center"/>
             </w:pPr>
             <w:r>
-              <w:t>n_estimators=800, num_leaves=31, learning_rate=0.03, subsample=0.9, colsample_bytree=0.9, random_state=42, n_jobs=-1, verbose=-1</w:t>
+              <w:t>n_estimators=800, num_leaves=31, learning_rate=0.03, subsample=0.9, colsample_bytree=0.9, random_state=42, n_jobs=-1, verbose=-1, class_weight=balanced</w:t>
             </w:r>
           </w:p>
         </w:tc>
@@ -841,7 +841,7 @@
               <w:jc w:val="center"/>
             </w:pPr>
             <w:r>
-              <w:t>Yiginlanmis Topluluk (Cat+LGBM+RF)</w:t>
+              <w:t>Yığınlanmış Topluluk (Cat+LGBM+RF)</w:t>
             </w:r>
           </w:p>
         </w:tc>
@@ -869,7 +869,7 @@
               <w:jc w:val="center"/>
             </w:pPr>
             <w:r>
-              <w:t>MLP (Sinir Agi)</w:t>
+              <w:t>MLP (Sinir Ağı)</w:t>
             </w:r>
           </w:p>
         </w:tc>
@@ -1066,7 +1066,7 @@
               <w:jc w:val="center"/>
             </w:pPr>
             <w:r>
-              <w:t>CatBoost</w:t>
+              <w:t>Lojistik Regresyon</w:t>
             </w:r>
           </w:p>
         </w:tc>
@@ -1079,7 +1079,7 @@
               <w:jc w:val="center"/>
             </w:pPr>
             <w:r>
-              <w:t>0.846 ± 0.093</w:t>
+              <w:t>0.637 ± 0.064</w:t>
             </w:r>
           </w:p>
         </w:tc>
@@ -1092,7 +1092,7 @@
               <w:jc w:val="center"/>
             </w:pPr>
             <w:r>
-              <w:t>0.901</w:t>
+              <w:t>0.423</w:t>
             </w:r>
           </w:p>
         </w:tc>
@@ -1105,7 +1105,7 @@
               <w:jc w:val="center"/>
             </w:pPr>
             <w:r>
-              <w:t>0.852</w:t>
+              <w:t>0.447</w:t>
             </w:r>
           </w:p>
         </w:tc>
@@ -1118,7 +1118,7 @@
               <w:jc w:val="center"/>
             </w:pPr>
             <w:r>
-              <w:t>0.709</w:t>
+              <w:t>0.578</w:t>
             </w:r>
           </w:p>
         </w:tc>
@@ -1131,7 +1131,7 @@
               <w:jc w:val="center"/>
             </w:pPr>
             <w:r>
-              <w:t>0.445</w:t>
+              <w:t>0.155</w:t>
             </w:r>
           </w:p>
         </w:tc>
@@ -1144,7 +1144,7 @@
               <w:jc w:val="center"/>
             </w:pPr>
             <w:r>
-              <w:t>0.137</w:t>
+              <w:t>0.244</w:t>
             </w:r>
           </w:p>
         </w:tc>
@@ -1157,7 +1157,113 @@
               <w:jc w:val="center"/>
             </w:pPr>
             <w:r>
-              <w:t>14.6 sn</w:t>
+              <w:t>0.1 sn</w:t>
+            </w:r>
+          </w:p>
+        </w:tc>
+      </w:tr>
+      <w:tr>
+        <w:tc>
+          <w:tcPr>
+            <w:tcW w:type="dxa" w:w="1814"/>
+          </w:tcPr>
+          <w:p>
+            <w:pPr>
+              <w:jc w:val="center"/>
+            </w:pPr>
+            <w:r>
+              <w:t>MLP (Sinir Ağı)</w:t>
+            </w:r>
+          </w:p>
+        </w:tc>
+        <w:tc>
+          <w:tcPr>
+            <w:tcW w:type="dxa" w:w="1304"/>
+          </w:tcPr>
+          <w:p>
+            <w:pPr>
+              <w:jc w:val="center"/>
+            </w:pPr>
+            <w:r>
+              <w:t>0.633 ± 0.078</w:t>
+            </w:r>
+          </w:p>
+        </w:tc>
+        <w:tc>
+          <w:tcPr>
+            <w:tcW w:type="dxa" w:w="850"/>
+          </w:tcPr>
+          <w:p>
+            <w:pPr>
+              <w:jc w:val="center"/>
+            </w:pPr>
+            <w:r>
+              <w:t>0.417</w:t>
+            </w:r>
+          </w:p>
+        </w:tc>
+        <w:tc>
+          <w:tcPr>
+            <w:tcW w:type="dxa" w:w="737"/>
+          </w:tcPr>
+          <w:p>
+            <w:pPr>
+              <w:jc w:val="center"/>
+            </w:pPr>
+            <w:r>
+              <w:t>0.283</w:t>
+            </w:r>
+          </w:p>
+        </w:tc>
+        <w:tc>
+          <w:tcPr>
+            <w:tcW w:type="dxa" w:w="1134"/>
+          </w:tcPr>
+          <w:p>
+            <w:pPr>
+              <w:jc w:val="center"/>
+            </w:pPr>
+            <w:r>
+              <w:t>0.565</w:t>
+            </w:r>
+          </w:p>
+        </w:tc>
+        <w:tc>
+          <w:tcPr>
+            <w:tcW w:type="dxa" w:w="737"/>
+          </w:tcPr>
+          <w:p>
+            <w:pPr>
+              <w:jc w:val="center"/>
+            </w:pPr>
+            <w:r>
+              <w:t>0.152</w:t>
+            </w:r>
+          </w:p>
+        </w:tc>
+        <w:tc>
+          <w:tcPr>
+            <w:tcW w:type="dxa" w:w="737"/>
+          </w:tcPr>
+          <w:p>
+            <w:pPr>
+              <w:jc w:val="center"/>
+            </w:pPr>
+            <w:r>
+              <w:t>0.210</w:t>
+            </w:r>
+          </w:p>
+        </w:tc>
+        <w:tc>
+          <w:tcPr>
+            <w:tcW w:type="dxa" w:w="1020"/>
+          </w:tcPr>
+          <w:p>
+            <w:pPr>
+              <w:jc w:val="center"/>
+            </w:pPr>
+            <w:r>
+              <w:t>2.8 sn</w:t>
             </w:r>
           </w:p>
         </w:tc>
@@ -1185,7 +1291,7 @@
               <w:jc w:val="center"/>
             </w:pPr>
             <w:r>
-              <w:t>0.842 ± 0.092</w:t>
+              <w:t>0.617 ± 0.051</w:t>
             </w:r>
           </w:p>
         </w:tc>
@@ -1198,7 +1304,7 @@
               <w:jc w:val="center"/>
             </w:pPr>
             <w:r>
-              <w:t>0.906</w:t>
+              <w:t>0.386</w:t>
             </w:r>
           </w:p>
         </w:tc>
@@ -1211,7 +1317,7 @@
               <w:jc w:val="center"/>
             </w:pPr>
             <w:r>
-              <w:t>0.857</w:t>
+              <w:t>0.221</w:t>
             </w:r>
           </w:p>
         </w:tc>
@@ -1224,7 +1330,7 @@
               <w:jc w:val="center"/>
             </w:pPr>
             <w:r>
-              <w:t>0.682</w:t>
+              <w:t>0.541</w:t>
             </w:r>
           </w:p>
         </w:tc>
@@ -1237,7 +1343,7 @@
               <w:jc w:val="center"/>
             </w:pPr>
             <w:r>
-              <w:t>0.396</w:t>
+              <w:t>0.108</w:t>
             </w:r>
           </w:p>
         </w:tc>
@@ -1250,7 +1356,7 @@
               <w:jc w:val="center"/>
             </w:pPr>
             <w:r>
-              <w:t>0.132</w:t>
+              <w:t>0.199</w:t>
             </w:r>
           </w:p>
         </w:tc>
@@ -1263,7 +1369,113 @@
               <w:jc w:val="center"/>
             </w:pPr>
             <w:r>
-              <w:t>6.3 sn</w:t>
+              <w:t>6.6 sn</w:t>
+            </w:r>
+          </w:p>
+        </w:tc>
+      </w:tr>
+      <w:tr>
+        <w:tc>
+          <w:tcPr>
+            <w:tcW w:type="dxa" w:w="1814"/>
+          </w:tcPr>
+          <w:p>
+            <w:pPr>
+              <w:jc w:val="center"/>
+            </w:pPr>
+            <w:r>
+              <w:t>CatBoost</w:t>
+            </w:r>
+          </w:p>
+        </w:tc>
+        <w:tc>
+          <w:tcPr>
+            <w:tcW w:type="dxa" w:w="1304"/>
+          </w:tcPr>
+          <w:p>
+            <w:pPr>
+              <w:jc w:val="center"/>
+            </w:pPr>
+            <w:r>
+              <w:t>0.593 ± 0.039</w:t>
+            </w:r>
+          </w:p>
+        </w:tc>
+        <w:tc>
+          <w:tcPr>
+            <w:tcW w:type="dxa" w:w="850"/>
+          </w:tcPr>
+          <w:p>
+            <w:pPr>
+              <w:jc w:val="center"/>
+            </w:pPr>
+            <w:r>
+              <w:t>0.361</w:t>
+            </w:r>
+          </w:p>
+        </w:tc>
+        <w:tc>
+          <w:tcPr>
+            <w:tcW w:type="dxa" w:w="737"/>
+          </w:tcPr>
+          <w:p>
+            <w:pPr>
+              <w:jc w:val="center"/>
+            </w:pPr>
+            <w:r>
+              <w:t>0.217</w:t>
+            </w:r>
+          </w:p>
+        </w:tc>
+        <w:tc>
+          <w:tcPr>
+            <w:tcW w:type="dxa" w:w="1134"/>
+          </w:tcPr>
+          <w:p>
+            <w:pPr>
+              <w:jc w:val="center"/>
+            </w:pPr>
+            <w:r>
+              <w:t>0.527</w:t>
+            </w:r>
+          </w:p>
+        </w:tc>
+        <w:tc>
+          <w:tcPr>
+            <w:tcW w:type="dxa" w:w="737"/>
+          </w:tcPr>
+          <w:p>
+            <w:pPr>
+              <w:jc w:val="center"/>
+            </w:pPr>
+            <w:r>
+              <w:t>0.075</w:t>
+            </w:r>
+          </w:p>
+        </w:tc>
+        <w:tc>
+          <w:tcPr>
+            <w:tcW w:type="dxa" w:w="737"/>
+          </w:tcPr>
+          <w:p>
+            <w:pPr>
+              <w:jc w:val="center"/>
+            </w:pPr>
+            <w:r>
+              <w:t>0.230</w:t>
+            </w:r>
+          </w:p>
+        </w:tc>
+        <w:tc>
+          <w:tcPr>
+            <w:tcW w:type="dxa" w:w="1020"/>
+          </w:tcPr>
+          <w:p>
+            <w:pPr>
+              <w:jc w:val="center"/>
+            </w:pPr>
+            <w:r>
+              <w:t>28.0 sn</w:t>
             </w:r>
           </w:p>
         </w:tc>
@@ -1291,7 +1503,7 @@
               <w:jc w:val="center"/>
             </w:pPr>
             <w:r>
-              <w:t>0.796 ± 0.155</w:t>
+              <w:t>0.584 ± 0.048</w:t>
             </w:r>
           </w:p>
         </w:tc>
@@ -1304,7 +1516,7 @@
               <w:jc w:val="center"/>
             </w:pPr>
             <w:r>
-              <w:t>0.891</w:t>
+              <w:t>0.363</w:t>
             </w:r>
           </w:p>
         </w:tc>
@@ -1317,7 +1529,7 @@
               <w:jc w:val="center"/>
             </w:pPr>
             <w:r>
-              <w:t>0.861</w:t>
+              <w:t>0.182</w:t>
             </w:r>
           </w:p>
         </w:tc>
@@ -1330,7 +1542,7 @@
               <w:jc w:val="center"/>
             </w:pPr>
             <w:r>
-              <w:t>0.690</w:t>
+              <w:t>0.525</w:t>
             </w:r>
           </w:p>
         </w:tc>
@@ -1343,7 +1555,7 @@
               <w:jc w:val="center"/>
             </w:pPr>
             <w:r>
-              <w:t>0.418</w:t>
+              <w:t>0.068</w:t>
             </w:r>
           </w:p>
         </w:tc>
@@ -1356,7 +1568,7 @@
               <w:jc w:val="center"/>
             </w:pPr>
             <w:r>
-              <w:t>0.137</w:t>
+              <w:t>0.230</w:t>
             </w:r>
           </w:p>
         </w:tc>
@@ -1369,219 +1581,7 @@
               <w:jc w:val="center"/>
             </w:pPr>
             <w:r>
-              <w:t>10.3 sn</w:t>
-            </w:r>
-          </w:p>
-        </w:tc>
-      </w:tr>
-      <w:tr>
-        <w:tc>
-          <w:tcPr>
-            <w:tcW w:type="dxa" w:w="1814"/>
-          </w:tcPr>
-          <w:p>
-            <w:pPr>
-              <w:jc w:val="center"/>
-            </w:pPr>
-            <w:r>
-              <w:t>Lojistik Regresyon</w:t>
-            </w:r>
-          </w:p>
-        </w:tc>
-        <w:tc>
-          <w:tcPr>
-            <w:tcW w:type="dxa" w:w="1304"/>
-          </w:tcPr>
-          <w:p>
-            <w:pPr>
-              <w:jc w:val="center"/>
-            </w:pPr>
-            <w:r>
-              <w:t>0.778 ± 0.045</w:t>
-            </w:r>
-          </w:p>
-        </w:tc>
-        <w:tc>
-          <w:tcPr>
-            <w:tcW w:type="dxa" w:w="850"/>
-          </w:tcPr>
-          <w:p>
-            <w:pPr>
-              <w:jc w:val="center"/>
-            </w:pPr>
-            <w:r>
-              <w:t>0.866</w:t>
-            </w:r>
-          </w:p>
-        </w:tc>
-        <w:tc>
-          <w:tcPr>
-            <w:tcW w:type="dxa" w:w="737"/>
-          </w:tcPr>
-          <w:p>
-            <w:pPr>
-              <w:jc w:val="center"/>
-            </w:pPr>
-            <w:r>
-              <w:t>0.812</w:t>
-            </w:r>
-          </w:p>
-        </w:tc>
-        <w:tc>
-          <w:tcPr>
-            <w:tcW w:type="dxa" w:w="1134"/>
-          </w:tcPr>
-          <w:p>
-            <w:pPr>
-              <w:jc w:val="center"/>
-            </w:pPr>
-            <w:r>
-              <w:t>0.676</w:t>
-            </w:r>
-          </w:p>
-        </w:tc>
-        <w:tc>
-          <w:tcPr>
-            <w:tcW w:type="dxa" w:w="737"/>
-          </w:tcPr>
-          <w:p>
-            <w:pPr>
-              <w:jc w:val="center"/>
-            </w:pPr>
-            <w:r>
-              <w:t>0.423</w:t>
-            </w:r>
-          </w:p>
-        </w:tc>
-        <w:tc>
-          <w:tcPr>
-            <w:tcW w:type="dxa" w:w="737"/>
-          </w:tcPr>
-          <w:p>
-            <w:pPr>
-              <w:jc w:val="center"/>
-            </w:pPr>
-            <w:r>
-              <w:t>0.151</w:t>
-            </w:r>
-          </w:p>
-        </w:tc>
-        <w:tc>
-          <w:tcPr>
-            <w:tcW w:type="dxa" w:w="1020"/>
-          </w:tcPr>
-          <w:p>
-            <w:pPr>
-              <w:jc w:val="center"/>
-            </w:pPr>
-            <w:r>
-              <w:t>0.3 sn</w:t>
-            </w:r>
-          </w:p>
-        </w:tc>
-      </w:tr>
-      <w:tr>
-        <w:tc>
-          <w:tcPr>
-            <w:tcW w:type="dxa" w:w="1814"/>
-          </w:tcPr>
-          <w:p>
-            <w:pPr>
-              <w:jc w:val="center"/>
-            </w:pPr>
-            <w:r>
-              <w:t>Yiginlanmis Topluluk (Cat+LGBM+RF)</w:t>
-            </w:r>
-          </w:p>
-        </w:tc>
-        <w:tc>
-          <w:tcPr>
-            <w:tcW w:type="dxa" w:w="1304"/>
-          </w:tcPr>
-          <w:p>
-            <w:pPr>
-              <w:jc w:val="center"/>
-            </w:pPr>
-            <w:r>
-              <w:t>0.734 ± 0.267</w:t>
-            </w:r>
-          </w:p>
-        </w:tc>
-        <w:tc>
-          <w:tcPr>
-            <w:tcW w:type="dxa" w:w="850"/>
-          </w:tcPr>
-          <w:p>
-            <w:pPr>
-              <w:jc w:val="center"/>
-            </w:pPr>
-            <w:r>
-              <w:t>0.873</w:t>
-            </w:r>
-          </w:p>
-        </w:tc>
-        <w:tc>
-          <w:tcPr>
-            <w:tcW w:type="dxa" w:w="737"/>
-          </w:tcPr>
-          <w:p>
-            <w:pPr>
-              <w:jc w:val="center"/>
-            </w:pPr>
-            <w:r>
-              <w:t>0.663</w:t>
-            </w:r>
-          </w:p>
-        </w:tc>
-        <w:tc>
-          <w:tcPr>
-            <w:tcW w:type="dxa" w:w="1134"/>
-          </w:tcPr>
-          <w:p>
-            <w:pPr>
-              <w:jc w:val="center"/>
-            </w:pPr>
-            <w:r>
-              <w:t>0.461</w:t>
-            </w:r>
-          </w:p>
-        </w:tc>
-        <w:tc>
-          <w:tcPr>
-            <w:tcW w:type="dxa" w:w="737"/>
-          </w:tcPr>
-          <w:p>
-            <w:pPr>
-              <w:jc w:val="center"/>
-            </w:pPr>
-            <w:r>
-              <w:t>-0.022</w:t>
-            </w:r>
-          </w:p>
-        </w:tc>
-        <w:tc>
-          <w:tcPr>
-            <w:tcW w:type="dxa" w:w="737"/>
-          </w:tcPr>
-          <w:p>
-            <w:pPr>
-              <w:jc w:val="center"/>
-            </w:pPr>
-            <w:r>
-              <w:t>0.226</w:t>
-            </w:r>
-          </w:p>
-        </w:tc>
-        <w:tc>
-          <w:tcPr>
-            <w:tcW w:type="dxa" w:w="1020"/>
-          </w:tcPr>
-          <w:p>
-            <w:pPr>
-              <w:jc w:val="center"/>
-            </w:pPr>
-            <w:r>
-              <w:t>33.9 sn</w:t>
+              <w:t>4.8 sn</w:t>
             </w:r>
           </w:p>
         </w:tc>
@@ -1609,7 +1609,7 @@
               <w:jc w:val="center"/>
             </w:pPr>
             <w:r>
-              <w:t>0.717 ± 0.229</w:t>
+              <w:t>0.581 ± 0.048</w:t>
             </w:r>
           </w:p>
         </w:tc>
@@ -1622,7 +1622,7 @@
               <w:jc w:val="center"/>
             </w:pPr>
             <w:r>
-              <w:t>0.877</w:t>
+              <w:t>0.359</w:t>
             </w:r>
           </w:p>
         </w:tc>
@@ -1635,7 +1635,7 @@
               <w:jc w:val="center"/>
             </w:pPr>
             <w:r>
-              <w:t>0.827</w:t>
+              <w:t>0.188</w:t>
             </w:r>
           </w:p>
         </w:tc>
@@ -1648,7 +1648,7 @@
               <w:jc w:val="center"/>
             </w:pPr>
             <w:r>
-              <w:t>0.615</w:t>
+              <w:t>0.523</w:t>
             </w:r>
           </w:p>
         </w:tc>
@@ -1661,7 +1661,7 @@
               <w:jc w:val="center"/>
             </w:pPr>
             <w:r>
-              <w:t>0.287</w:t>
+              <w:t>0.067</w:t>
             </w:r>
           </w:p>
         </w:tc>
@@ -1674,7 +1674,7 @@
               <w:jc w:val="center"/>
             </w:pPr>
             <w:r>
-              <w:t>0.172</w:t>
+              <w:t>0.231</w:t>
             </w:r>
           </w:p>
         </w:tc>
@@ -1687,7 +1687,7 @@
               <w:jc w:val="center"/>
             </w:pPr>
             <w:r>
-              <w:t>1.4 sn</w:t>
+              <w:t>3.5 sn</w:t>
             </w:r>
           </w:p>
         </w:tc>
@@ -1702,7 +1702,7 @@
               <w:jc w:val="center"/>
             </w:pPr>
             <w:r>
-              <w:t>MLP (Sinir Agi)</w:t>
+              <w:t>Yığınlanmış Topluluk (Cat+LGBM+RF)</w:t>
             </w:r>
           </w:p>
         </w:tc>
@@ -1715,7 +1715,7 @@
               <w:jc w:val="center"/>
             </w:pPr>
             <w:r>
-              <w:t>0.428 ± 0.109</w:t>
+              <w:t>0.518 ± 0.037</w:t>
             </w:r>
           </w:p>
         </w:tc>
@@ -1728,7 +1728,7 @@
               <w:jc w:val="center"/>
             </w:pPr>
             <w:r>
-              <w:t>0.711</w:t>
+              <w:t>0.305</w:t>
             </w:r>
           </w:p>
         </w:tc>
@@ -1741,7 +1741,7 @@
               <w:jc w:val="center"/>
             </w:pPr>
             <w:r>
-              <w:t>0.674</w:t>
+              <w:t>0.310</w:t>
             </w:r>
           </w:p>
         </w:tc>
@@ -1754,7 +1754,7 @@
               <w:jc w:val="center"/>
             </w:pPr>
             <w:r>
-              <w:t>0.453</w:t>
+              <w:t>0.504</w:t>
             </w:r>
           </w:p>
         </w:tc>
@@ -1767,7 +1767,7 @@
               <w:jc w:val="center"/>
             </w:pPr>
             <w:r>
-              <w:t>-0.044</w:t>
+              <w:t>-0.007</w:t>
             </w:r>
           </w:p>
         </w:tc>
@@ -1780,7 +1780,7 @@
               <w:jc w:val="center"/>
             </w:pPr>
             <w:r>
-              <w:t>0.229</w:t>
+              <w:t>0.262</w:t>
             </w:r>
           </w:p>
         </w:tc>
@@ -1793,7 +1793,7 @@
               <w:jc w:val="center"/>
             </w:pPr>
             <w:r>
-              <w:t>0.4 sn</w:t>
+              <w:t>124.0 sn</w:t>
             </w:r>
           </w:p>
         </w:tc>
@@ -2112,7 +2112,7 @@
               <a:graphicData uri="http://schemas.openxmlformats.org/drawingml/2006/picture">
                 <pic:pic>
                   <pic:nvPicPr>
-                    <pic:cNvPr id="0" name="catboost_confusion.png"/>
+                    <pic:cNvPr id="0" name="logistic_regression_confusion.png"/>
                     <pic:cNvPicPr/>
                   </pic:nvPicPr>
                   <pic:blipFill>
@@ -2144,7 +2144,7 @@
           <w:i/>
           <w:sz w:val="18"/>
         </w:rPr>
-        <w:t>Şekil 6: CatBoost — karışıklık matrisi (OOF, eşik=0,5).</w:t>
+        <w:t>Şekil 6: Lojistik Regresyon — karışıklık matrisi (OOF, eşik=0,5).</w:t>
       </w:r>
     </w:p>
     <w:p>
@@ -2387,7 +2387,7 @@
     </w:p>
     <w:p>
       <w:r>
-        <w:t>(1) Veri kümesi küçüktür (454 kayıt); katalog genişledikçe (özellikle QuakeMindBackend'deki güncel veriyle) modellerin yeniden çalıştırılması önerilir. (2) Walk-forward katları arasında gözlenen yüksek varyans (bkz. Şekil 4), bazı modellerin ortalama skorlarının istikrarsız olduğuna işaret etmektedir; tek bir ortalama değer yerine daima std ile birlikte raporlanmalıdır. (3) Kısa vadeli aktivite özellikleri (`rolling_*`, `event_count_7d`) global ölçekte (bölgeye özel olmayan) hesaplanmaktadır; bölgesel bir pencereleme gelecekteki bir iyileştirme konusu olabilir. (4) Artçı-şok ayıklama basitleştirilmiş bir kural tabanlı yöntemdir (Reasenberg/Gardner-Knopoff gibi standart algoritmalar değildir).</w:t>
+        <w:t>(1) Veri kümesi küçüktür (13609 kayıt); katalog genişledikçe (özellikle QuakeMindBackend'deki güncel veriyle) modellerin yeniden çalıştırılması önerilir. (2) Walk-forward katları arasında gözlenen yüksek varyans (bkz. Şekil 4), bazı modellerin ortalama skorlarının istikrarsız olduğuna işaret etmektedir; tek bir ortalama değer yerine daima std ile birlikte raporlanmalıdır. (3) Kısa vadeli aktivite özellikleri (`rolling_*`, `event_count_7d`) global ölçekte (bölgeye özel olmayan) hesaplanmaktadır; bölgesel bir pencereleme gelecekteki bir iyileştirme konusu olabilir. (4) Artçı-şok ayıklama basitleştirilmiş bir kural tabanlı yöntemdir (Reasenberg/Gardner-Knopoff gibi standart algoritmalar değildir).</w:t>
       </w:r>
     </w:p>
     <w:p>

</xml_diff>